<commit_message>
add session 5 and update session2
</commit_message>
<xml_diff>
--- a/session_1_dhruvi.docx
+++ b/session_1_dhruvi.docx
@@ -15,6 +15,18 @@
           <w:shd w:val="clear" w:color="auto" w:fill="FFFFFF"/>
         </w:rPr>
       </w:pPr>
+      <w:r>
+        <w:rPr>
+          <w:rFonts w:ascii="Segoe UI" w:hAnsi="Segoe UI" w:cs="Segoe UI"/>
+          <w:b/>
+          <w:bCs/>
+          <w:color w:val="878A99"/>
+          <w:sz w:val="24"/>
+          <w:szCs w:val="24"/>
+          <w:shd w:val="clear" w:color="auto" w:fill="FFFFFF"/>
+        </w:rPr>
+        <w:t xml:space="preserve"> </w:t>
+      </w:r>
       <w:r>
         <w:rPr>
           <w:rFonts w:ascii="Segoe UI" w:hAnsi="Segoe UI" w:cs="Segoe UI"/>
@@ -184,8 +196,6 @@
           <w:lang w:eastAsia="en-IN"/>
         </w:rPr>
       </w:pPr>
-      <w:bookmarkStart w:id="0" w:name="_GoBack"/>
-      <w:bookmarkEnd w:id="0"/>
       <w:r>
         <w:rPr>
           <w:rFonts w:ascii="Times New Roman" w:eastAsia="Times New Roman" w:hAnsi="Times New Roman" w:cs="Times New Roman"/>
@@ -493,6 +503,8 @@
         </w:rPr>
         <w:t>3 Service Companies</w:t>
       </w:r>
+      <w:bookmarkStart w:id="0" w:name="_GoBack"/>
+      <w:bookmarkEnd w:id="0"/>
     </w:p>
     <w:p>
       <w:pPr>

</xml_diff>